<commit_message>
docs: align all project guidance with Ontology v2
Refresh runbooks, architecture guides, notebook prose and mirrors, workflow Word documents, and setup help. Distinguish v2 core completion from blocked optional agent capabilities and preserve executable behavior.

Co-authored-by: Copilot <223556219+Copilot@users.noreply.github.com>
</commit_message>
<xml_diff>
--- a/Raw/RTI_Notebooks/RTI_Ontology_Workflow_clean.docx
+++ b/Raw/RTI_Notebooks/RTI_Ontology_Workflow_clean.docx
@@ -8,7 +8,7 @@
         <w:jc w:val="center"/>
       </w:pPr>
       <w:r>
-        <w:t>RTI Demo - Notebook Workflow to Ontology</w:t>
+        <w:t>RTI Demo - Notebook Workflow to Ontology v2</w:t>
       </w:r>
     </w:p>
     <w:p>
@@ -20,7 +20,7 @@
           <w:color w:val="646464"/>
           <w:sz w:val="18"/>
         </w:rPr>
-        <w:t>Fabric RTI / Ontology workflow overview</w:t>
+        <w:t>Fabric RTI / Ontology v2-only workflow and readiness boundaries</w:t>
       </w:r>
     </w:p>
     <w:p>
@@ -28,7 +28,22 @@
         <w:pStyle w:val="Heading1"/>
       </w:pPr>
       <w:r>
-        <w:t>Notebook flow</w:t>
+        <w:t>Notebook flow and generation contract</w:t>
+      </w:r>
+    </w:p>
+    <w:p>
+      <w:r>
+        <w:t>This workflow supports Ontology v2 only. Creation explicitly submits properties.generation as integer 2 and a TMDL definition containing database.tmdl, model.tmdl, and default namespace metadata. Live item metadata and definition readbacks must agree with that contract before the ontology can be used.</w:t>
+      </w:r>
+    </w:p>
+    <w:p>
+      <w:r>
+        <w:t>An existing generation-1 ontology is rejected, not automatically migrated, overwritten, or deleted. Select a separate verified v2 target. The REST /v1 route and environment name suffix V9 are not ontology generation indicators.</w:t>
+      </w:r>
+    </w:p>
+    <w:p>
+      <w:r>
+        <w:t>Canonical RTI_004_build_ontology_mapping_rti_structured, RTI_005_entity_DataBinding_rti_structured, and RTI_006_TimeSeriesBinding_RTI_signal notebook names remain unchanged. Generation is determined from live metadata and TMDL, not filenames.</w:t>
       </w:r>
     </w:p>
     <w:tbl>
@@ -140,7 +155,7 @@
               <w:rPr>
                 <w:sz w:val="18"/>
               </w:rPr>
-              <w:t>Creates shared foundation and writes rti_demo_settings.</w:t>
+              <w:t>Creates/resolves the Lakehouse and shared settings; remaps downstream Lakehouse metadata.</w:t>
             </w:r>
           </w:p>
         </w:tc>
@@ -173,7 +188,7 @@
               <w:rPr>
                 <w:sz w:val="18"/>
               </w:rPr>
-              <w:t>Creates structured/static demo source data.</w:t>
+              <w:t>Sets up the Eventhouse, KQL database, and telemetry table.</w:t>
             </w:r>
           </w:p>
         </w:tc>
@@ -239,7 +254,7 @@
               <w:rPr>
                 <w:sz w:val="18"/>
               </w:rPr>
-              <w:t>Builds and deploys ontology entity and relationship definitions.</w:t>
+              <w:t>Builds v2 TMDL entities and semantic relationships with strict generation checks.</w:t>
             </w:r>
           </w:p>
         </w:tc>
@@ -272,7 +287,7 @@
               <w:rPr>
                 <w:sz w:val="18"/>
               </w:rPr>
-              <w:t>Adds static Lakehouse DataBindings and relationship contextualizations.</w:t>
+              <w:t>Binds static entity properties to DirectLake backing tables and physical relationships.</w:t>
             </w:r>
           </w:p>
         </w:tc>
@@ -305,7 +320,7 @@
               <w:rPr>
                 <w:sz w:val="18"/>
               </w:rPr>
-              <w:t>Configures Eventstream/Eventhouse and generates OPC UA telemetry.</w:t>
+              <w:t>Binds Eventhouse timeSeries backing data to signal_master.</w:t>
             </w:r>
           </w:p>
         </w:tc>
@@ -338,7 +353,7 @@
               <w:rPr>
                 <w:sz w:val="18"/>
               </w:rPr>
-              <w:t>Adds Eventhouse TimeSeries DataBinding to signal_master.</w:t>
+              <w:t>Configures the telemetry stream and generates OPC UA values.</w:t>
             </w:r>
           </w:p>
         </w:tc>
@@ -357,7 +372,7 @@
               <w:rPr>
                 <w:sz w:val="18"/>
               </w:rPr>
-              <w:t>OntologyAgent</w:t>
+              <w:t>008 / 009 / 010 / 011</w:t>
             </w:r>
           </w:p>
         </w:tc>
@@ -371,7 +386,7 @@
               <w:rPr>
                 <w:sz w:val="18"/>
               </w:rPr>
-              <w:t>Uses the finished ontology as the semantic access layer for questions and analysis.</w:t>
+              <w:t>Dashboard / gated Data Agent / blocked Operations Agent / independent SQL and GraphQL setup. See readiness rules below.</w:t>
             </w:r>
           </w:p>
         </w:tc>
@@ -397,7 +412,7 @@
         <w:t xml:space="preserve">• </w:t>
       </w:r>
       <w:r>
-        <w:t>Creates or resolves the core Fabric items and writes the shared settings table: rti_demo_settings.</w:t>
+        <w:t>Creates or resolves the Lakehouse foundation, configures the selected source path, and writes the shared settings table: rti_demo_settings.</w:t>
       </w:r>
     </w:p>
     <w:p>
@@ -427,7 +442,7 @@
         <w:t xml:space="preserve">• </w:t>
       </w:r>
       <w:r>
-        <w:t>This avoids reintroducing hardcoded workspace, item, folder, or table names in notebooks 002-007.</w:t>
+        <w:t>Remaps downstream notebook Lakehouse metadata to the selected workspace/Lakehouse. Later notebooks use shared settings instead of hardcoded workspace, item, folder, or table names.</w:t>
       </w:r>
     </w:p>
     <w:p>
@@ -481,7 +496,7 @@
         <w:pStyle w:val="Heading1"/>
       </w:pPr>
       <w:r>
-        <w:t>002 - Setup structured/static demo data</w:t>
+        <w:t>002 - Set up Eventhouse telemetry storage</w:t>
       </w:r>
     </w:p>
     <w:p>
@@ -496,7 +511,7 @@
         <w:t xml:space="preserve">• </w:t>
       </w:r>
       <w:r>
-        <w:t>Prepares the static plant metadata that later becomes ontology entities.</w:t>
+        <w:t>Sets up or resolves the Eventhouse, KQL database, and OPCUAEvents telemetry table used by 006 and 007.</w:t>
       </w:r>
     </w:p>
     <w:p>
@@ -511,7 +526,7 @@
         <w:t xml:space="preserve">• </w:t>
       </w:r>
       <w:r>
-        <w:t>The structured model is: facility -&gt; system -&gt; equipment -&gt; instrument -&gt; signal_master.</w:t>
+        <w:t>Keep the telemetry schema aligned with event_time, opcua_node_id, value, and quality. Eventhouse remains the time-series store; telemetry is not copied into a Lakehouse ontology table.</w:t>
       </w:r>
     </w:p>
     <w:p>
@@ -526,7 +541,7 @@
         <w:t xml:space="preserve">• </w:t>
       </w:r>
       <w:r>
-        <w:t>signal_master is the bridge between static asset metadata and RTI telemetry because it contains opcua_node_id.</w:t>
+        <w:t>The shared sensor identity opcua_node_id links Eventhouse telemetry with signal_master static metadata.</w:t>
       </w:r>
     </w:p>
     <w:p>
@@ -541,7 +556,7 @@
         <w:t xml:space="preserve">• </w:t>
       </w:r>
       <w:r>
-        <w:t>Sensors/signals are defined in the metadata/source files that feed this structured layer. To add sensors, add them to that metadata so they appear in silver_signal_master after 003.</w:t>
+        <w:t>This storage setup does not establish agent readiness or provision an Operations Agent alert pipeline.</w:t>
       </w:r>
     </w:p>
     <w:p>
@@ -578,7 +593,7 @@
         <w:t xml:space="preserve">• </w:t>
       </w:r>
       <w:r>
-        <w:t>Creates the clean Lakehouse tables used by the ontology generation step.</w:t>
+        <w:t>Ingests the configured structured source and creates clean Lakehouse silver tables for the v2 ontology. The asset hierarchy is facilities -&gt; systems -&gt; equipment -&gt; instruments -&gt; signal_master.</w:t>
       </w:r>
     </w:p>
     <w:p>
@@ -593,7 +608,7 @@
         <w:t xml:space="preserve">• </w:t>
       </w:r>
       <w:r>
-        <w:t>The important signal table is silver_signal_master.</w:t>
+        <w:t>Sensors are defined in metadata/source files, not by the ontology. Add or remove sensors there, then rerun 003 and affected downstream steps so silver_signal_master matches the source.</w:t>
       </w:r>
     </w:p>
     <w:p>
@@ -693,7 +708,7 @@
         <w:pStyle w:val="Heading1"/>
       </w:pPr>
       <w:r>
-        <w:t>004 - Build and deploy ontology definition</w:t>
+        <w:t>004 - Build the Ontology v2 TMDL definition</w:t>
       </w:r>
     </w:p>
     <w:p>
@@ -708,7 +723,7 @@
         <w:t xml:space="preserve">• </w:t>
       </w:r>
       <w:r>
-        <w:t>Reads the silver tables and creates ontology EntityTypes.</w:t>
+        <w:t>Reads silver schemas and writes entity declarations in entities/*.tmdl. It requires a live generation-2 target and rejects generation-1 items rather than silently converting them.</w:t>
       </w:r>
     </w:p>
     <w:p>
@@ -723,7 +738,7 @@
         <w:t xml:space="preserve">• </w:t>
       </w:r>
       <w:r>
-        <w:t>Creates the relationship path: signal_master -&gt; instruments -&gt; equipment -&gt; systems -&gt; facilities.</w:t>
+        <w:t>Defines the semantic entity path in entityRelationships.tmdl: signal_master -&gt; instruments -&gt; equipment -&gt; systems -&gt; facilities. This is distinct from physical table joins in relationships.tmdl.</w:t>
       </w:r>
     </w:p>
     <w:p>
@@ -753,7 +768,7 @@
         <w:t xml:space="preserve">• </w:t>
       </w:r>
       <w:r>
-        <w:t>Adds event_time, value, and quality as time-series properties on signal_master.</w:t>
+        <w:t>Declares the signal time-series contract for event_time, value, and quality in TMDL; 006 connects it to Eventhouse timeSeries backing data. Legacy JSON EntityTypes/DataBindings are not the v2 definition format.</w:t>
       </w:r>
     </w:p>
     <w:p>
@@ -768,7 +783,7 @@
         <w:t xml:space="preserve">• </w:t>
       </w:r>
       <w:r>
-        <w:t>Writes audit/helper tables: ontology_parts_latest, ontology_entity_audit, ontology_relationship_audit.</w:t>
+        <w:t>Preserves unknown definition parts and existing bindings during reruns. Writes audit/helper tables including ontology_parts_latest, ontology_entity_audit, and ontology_relationship_audit; only verified service readback establishes success.</w:t>
       </w:r>
     </w:p>
     <w:p>
@@ -826,7 +841,7 @@
         <w:pStyle w:val="Heading1"/>
       </w:pPr>
       <w:r>
-        <w:t>005 - Bind Lakehouse static data to ontology</w:t>
+        <w:t>005 - Bind static data through v2 DirectLake tables</w:t>
       </w:r>
     </w:p>
     <w:p>
@@ -841,7 +856,7 @@
         <w:t xml:space="preserve">• </w:t>
       </w:r>
       <w:r>
-        <w:t>Adds static Lakehouse DataBindings for the ontology entities.</w:t>
+        <w:t>Adds Lakehouse DirectLake backing declarations in tables/*.tmdl and connects entity properties to their backing columns.</w:t>
       </w:r>
     </w:p>
     <w:p>
@@ -856,7 +871,7 @@
         <w:t xml:space="preserve">• </w:t>
       </w:r>
       <w:r>
-        <w:t>Binds signal_master to silver_signal_master using opcua_node_id.</w:t>
+        <w:t>Binds signal_master static properties to silver_signal_master using opcua_node_id; retains existing timeSeries bindings and unrelated parts.</w:t>
       </w:r>
     </w:p>
     <w:p>
@@ -871,7 +886,7 @@
         <w:t xml:space="preserve">• </w:t>
       </w:r>
       <w:r>
-        <w:t>Adds relationship contextualizations so rows connect through instrument_id, equipment_id, system_id, and facility_id.</w:t>
+        <w:t>Defines physical backing-table relationships in relationships.tmdl using instrument_id, equipment_id, system_id, and facility_id. Semantic entity relationships remain in entityRelationships.tmdl.</w:t>
       </w:r>
     </w:p>
     <w:p>
@@ -886,7 +901,7 @@
         <w:t xml:space="preserve">• </w:t>
       </w:r>
       <w:r>
-        <w:t>005 does not bind Eventhouse telemetry.</w:t>
+        <w:t>005 does not add Eventhouse telemetry bindings. It strictly reads and verifies the live v2 definition and submitted binding readback; failures are not treated as an empty model.</w:t>
       </w:r>
     </w:p>
     <w:p>
@@ -924,7 +939,7 @@
         <w:pStyle w:val="Heading1"/>
       </w:pPr>
       <w:r>
-        <w:t>006 - Configure stream and generate sensor values</w:t>
+        <w:t>006 - Bind Eventhouse time-series data in TMDL</w:t>
       </w:r>
     </w:p>
     <w:p>
@@ -939,7 +954,7 @@
         <w:t xml:space="preserve">• </w:t>
       </w:r>
       <w:r>
-        <w:t>Creates or updates the Eventstream, Custom Endpoint source, DefaultStream, Eventhouse destination, KQL database, and KQL table.</w:t>
+        <w:t>Adds Eventhouse timeSeries backing declarations in tables/*.tmdl and binds signal_master time-series properties to their source columns.</w:t>
       </w:r>
     </w:p>
     <w:p>
@@ -954,7 +969,7 @@
         <w:t xml:space="preserve">• </w:t>
       </w:r>
       <w:r>
-        <w:t>Reads silver_signal_master to know which sensors/signals to generate telemetry for.</w:t>
+        <w:t>Uses opcua_node_id as the shared identity and event_time as the time-series timestamp, with value and quality as telemetry properties.</w:t>
       </w:r>
     </w:p>
     <w:p>
@@ -970,7 +985,7 @@
         <w:t xml:space="preserve">• </w:t>
       </w:r>
       <w:r>
-        <w:t>The generated values come from the simulator code in 006, not from the metadata files.</w:t>
+        <w:t>Retains the existing DirectLake static bindings, semantic relationships, physical relationships, and unknown definition parts.</w:t>
       </w:r>
     </w:p>
     <w:p>
@@ -985,7 +1000,7 @@
         <w:t xml:space="preserve">• </w:t>
       </w:r>
       <w:r>
-        <w:t>The cleaned simulator currently uses signal_type-based normal ranges and random quality states.</w:t>
+        <w:t>Requires strict generation and definition reads plus service readback of the submitted v2 bindings; a successful request alone is not sufficient.</w:t>
       </w:r>
     </w:p>
     <w:p>
@@ -1000,7 +1015,7 @@
         <w:t xml:space="preserve">• </w:t>
       </w:r>
       <w:r>
-        <w:t>Drift, spikes, stuck sensors, bad-quality windows, or other anomalies would be added in this 006 simulator section if needed.</w:t>
+        <w:t>No copied RTI Lakehouse table or separate rti_measurements entity is required. This binding step does not generate telemetry; 007 does.</w:t>
       </w:r>
     </w:p>
     <w:p>
@@ -1034,7 +1049,7 @@
         <w:pStyle w:val="Heading1"/>
       </w:pPr>
       <w:r>
-        <w:t>007 - Bind Eventhouse telemetry to ontology</w:t>
+        <w:t>007 - Configure the stream and generate sensor values</w:t>
       </w:r>
     </w:p>
     <w:p>
@@ -1049,7 +1064,7 @@
         <w:t xml:space="preserve">• </w:t>
       </w:r>
       <w:r>
-        <w:t>Adds the Eventhouse TimeSeries DataBinding to signal_master.</w:t>
+        <w:t>Configures the Eventstream path to Eventhouse and generates telemetry for sensors selected from silver_signal_master.</w:t>
       </w:r>
     </w:p>
     <w:p>
@@ -1064,7 +1079,7 @@
         <w:t xml:space="preserve">• </w:t>
       </w:r>
       <w:r>
-        <w:t>Binds OPCUAEvents to signal_master by opcua_node_id.</w:t>
+        <w:t>Generated values come from the 007 simulator logic, not static metadata. Configure normal ranges, quality states, drift, spikes, stuck sensors, or other scenarios in that simulator as needed.</w:t>
       </w:r>
     </w:p>
     <w:p>
@@ -1079,7 +1094,7 @@
         <w:t xml:space="preserve">• </w:t>
       </w:r>
       <w:r>
-        <w:t>This connects live telemetry values to the static sensor metadata and asset hierarchy.</w:t>
+        <w:t>Telemetry rows follow the schema below. The 006 timeSeries binding connects these values to static metadata and the asset hierarchy; stream activity does not prove agent or browser readiness.</w:t>
       </w:r>
     </w:p>
     <w:p>
@@ -1113,7 +1128,7 @@
         <w:pStyle w:val="Heading1"/>
       </w:pPr>
       <w:r>
-        <w:t>Final model</w:t>
+        <w:t>Combined static and time-series model</w:t>
       </w:r>
     </w:p>
     <w:p>
@@ -1145,7 +1160,7 @@
       </w:r>
       <w:r>
         <w:br/>
-        <w:t>Ontology</w:t>
+        <w:t>Ontology v2</w:t>
       </w:r>
       <w:r>
         <w:br/>
@@ -1155,8 +1170,111 @@
       </w:r>
     </w:p>
     <w:p>
-      <w:r>
-        <w:br w:type="page"/>
+      <w:pPr>
+        <w:pStyle w:val="Heading1"/>
+      </w:pPr>
+      <w:r>
+        <w:t>008-011 - Dashboard, agents, SQL, and GraphQL</w:t>
+      </w:r>
+    </w:p>
+    <w:p>
+      <w:r>
+        <w:rPr>
+          <w:b/>
+        </w:rPr>
+        <w:t xml:space="preserve">008 - Real-time dashboard. </w:t>
+      </w:r>
+      <w:r>
+        <w:t>The dashboard uses Eventhouse/KQL data. Dashboard setup is separate from Ontology v2 agent availability and does not certify the entire pipeline.</w:t>
+      </w:r>
+    </w:p>
+    <w:p>
+      <w:r>
+        <w:rPr>
+          <w:b/>
+        </w:rPr>
+        <w:t xml:space="preserve">009 - Data Agent capability gate. </w:t>
+      </w:r>
+      <w:r>
+        <w:t>ontology_data_agent_mode=auto remains blocked for the v2 rollout; auto is not a readiness claim. disabled skips agent integration. enabled is an explicit attempt, not a guarantee that the tenant supports the v2 source contract.</w:t>
+      </w:r>
+    </w:p>
+    <w:p>
+      <w:r>
+        <w:t>An enabled Data Agent attempt requires a verified live generation-2 ontology and the exact selected ontology ID/workspace in the agent source. Strict draft and published readbacks must retain that identity before success is reported. Existing legacy or unrelated sources are rejected, not silently reused or deleted; authentication, API, schema, readback, and publication errors propagate.</w:t>
+      </w:r>
+    </w:p>
+    <w:p>
+      <w:r>
+        <w:rPr>
+          <w:b/>
+        </w:rPr>
+        <w:t xml:space="preserve">010 - Operations Agent blocked. </w:t>
+      </w:r>
+      <w:r>
+        <w:t>Automation remains blocked pending a verified v2 playbook contract and resolution of known issue 1970. auto records the unsupported capability without claiming readiness; disabled skips the feature; enabled fails before writes. The old embedded playbook has been removed. No automatic Operations Agent alert pipeline is provisioned.</w:t>
+      </w:r>
+    </w:p>
+    <w:p>
+      <w:r>
+        <w:rPr>
+          <w:b/>
+        </w:rPr>
+        <w:t xml:space="preserve">011 - Independent SQL and GraphQL setup. </w:t>
+      </w:r>
+      <w:r>
+        <w:t>With the application SQL database and tables already present, this notebook seeds operational SQL data and wires the Lakehouse GraphQL endpoint independently of Data Agent availability. It does not deploy the app.</w:t>
+      </w:r>
+    </w:p>
+    <w:p>
+      <w:r>
+        <w:t>The optional SQL-source addition honors the Data Agent mode. An enabled attempt verifies the selected v2 ontology identity and submitted SQL source in the draft, then verifies both published counterparts before reporting success. Errors propagate; a skipped or blocked agent step must not be described as published or ready.</w:t>
+      </w:r>
+    </w:p>
+    <w:p>
+      <w:pPr>
+        <w:pStyle w:val="Heading1"/>
+      </w:pPr>
+      <w:r>
+        <w:t>Application access paths and limits</w:t>
+      </w:r>
+    </w:p>
+    <w:p>
+      <w:r>
+        <w:t>The application consumes the v2 TMDL contract for entities, properties, and relationships; GraphQL supplies the instance projection, KQL supplies telemetry, and SQL supplies operational data. These are complementary data paths, not proof of a native ontology GQL query endpoint.</w:t>
+      </w:r>
+    </w:p>
+    <w:p>
+      <w:r>
+        <w:t>An optional native v2 GraphModel association remains unverified. Do not label the app native-GQL-ready, infer GraphModel readiness from GraphQL success, or substitute a generation-1 graph association. Capability and error states must remain visible.</w:t>
+      </w:r>
+    </w:p>
+    <w:p>
+      <w:pPr>
+        <w:pStyle w:val="Heading1"/>
+      </w:pPr>
+      <w:r>
+        <w:t>Validation and rerun checklist</w:t>
+      </w:r>
+    </w:p>
+    <w:p>
+      <w:r>
+        <w:t>Before writes: resolve the configured workspace and ontology; confirm integer generation 2; strictly read the complete live definition. A failed or malformed read must not become an empty definition. For creation, explicitly include database/model/default namespace TMDL metadata.</w:t>
+      </w:r>
+    </w:p>
+    <w:p>
+      <w:r>
+        <w:t>During updates: merge only owned TMDL content and preserve unknown parts plus existing DirectLake and Eventhouse bindings. Keep entityRelationships.tmdl semantic relationships separate from relationships.tmdl physical backing relationships.</w:t>
+      </w:r>
+    </w:p>
+    <w:p>
+      <w:r>
+        <w:t>After writes: read back the live generation and definition, verify the intended structure and binding content, and retain evidence of preserved parts across reruns. A successful HTTP response or local audit row alone does not establish readiness.</w:t>
+      </w:r>
+    </w:p>
+    <w:p>
+      <w:r>
+        <w:t>Certification boundary: recent work did not deploy applications or agents. Full Spark pipeline execution and browser end-to-end behavior are not certified. Ontology definition/readback checks must not be presented as completion of those separate tests.</w:t>
       </w:r>
     </w:p>
     <w:p>
@@ -1277,7 +1395,7 @@
               <w:rPr>
                 <w:sz w:val="18"/>
               </w:rPr>
-              <w:t>Update the simulator logic in 006.</w:t>
+              <w:t>Update the simulator logic in 007.</w:t>
             </w:r>
           </w:p>
         </w:tc>
@@ -1310,7 +1428,7 @@
               <w:rPr>
                 <w:sz w:val="18"/>
               </w:rPr>
-              <w:t>Add the scenario logic in the 006 simulator section.</w:t>
+              <w:t>Add the scenario logic in the 007 simulator section.</w:t>
             </w:r>
           </w:p>
         </w:tc>
@@ -1343,7 +1461,7 @@
               <w:rPr>
                 <w:sz w:val="18"/>
               </w:rPr>
-              <w:t>Update 004 timeseriesProperties, 006 table/payload, and 007 binding.</w:t>
+              <w:t>Align 002 Eventhouse schema, 004 entity TMDL, 006 timeSeries backing/bindings, and 007 payloads. Verify all readbacks.</w:t>
             </w:r>
           </w:p>
         </w:tc>
@@ -1398,7 +1516,7 @@
         <w:color w:val="969696"/>
         <w:sz w:val="14"/>
       </w:rPr>
-      <w:t>Fabric RTI / Ontology workflow overview</w:t>
+      <w:t>Fabric RTI / Ontology v2 workflow overview</w:t>
     </w:r>
   </w:p>
 </w:ftr>

</xml_diff>

<commit_message>
fix: restore native Ontology v2 graph topology
Use explicitly bound native GraphModel queries as topology authority, retain KQL/SQL enrichment, and fail closed on invalid or incomplete results. Serialize optional agent status writes after a live V3 Delta conflict. Update regression coverage and setup guidance.

Co-authored-by: Copilot <223556219+Copilot@users.noreply.github.com>
</commit_message>
<xml_diff>
--- a/Raw/RTI_Notebooks/RTI_Ontology_Workflow_clean.docx
+++ b/Raw/RTI_Notebooks/RTI_Ontology_Workflow_clean.docx
@@ -1241,12 +1241,12 @@
     </w:p>
     <w:p>
       <w:r>
-        <w:t>The application consumes the v2 TMDL contract for entities, properties, and relationships; GraphQL supplies the instance projection, KQL supplies telemetry, and SQL supplies operational data. These are complementary data paths, not proof of a native ontology GQL query endpoint.</w:t>
+        <w:t>The application requires a live numeric generation-2 ontology, its TMDL contract, and an explicitly bound ontology-managed GraphModel. Native GQL entities and relationships are authoritative for the graph canvas, tree, and scopes. KQL telemetry and operational SQL only enrich actual native entities; GraphQL serves other pages and is not a graph dependency or fallback. No STID or foreign-key topology is fabricated. In the selected ontology choose Manage graph → select eligible entities and relationships → Continue → Materialize. Graph sources require keys and Delta or mirrored bindings; multi-backing-table signal_master may be ineligible, but native instruments still receive KQL telemetry. No published ontology-owned projection/materialization REST endpoint is established, so this is a manual portal prerequisite, not a fully unattended deployment promise.</w:t>
       </w:r>
     </w:p>
     <w:p>
       <w:r>
-        <w:t>An optional native v2 GraphModel association remains unverified. Do not label the app native-GQL-ready, infer GraphModel readiness from GraphQL success, or substitute a generation-1 graph association. Capability and error states must remain visible.</w:t>
+        <w:t>Configure RAYFIN_PUBLIC_ONTOLOGY_GRAPH_BINDING JSON with workspaceId, ontologyId, and graphModelId. Optional nodeTypes and edgeTypes map getQueryableGraphType aliases to exact ontology type names or IDs when labels differ; the namespace-label delimiter is undocumented and must not be guessed. Public REST metadata does not expose ownership: matching names, a sole graph, or structural similarity are not proof. The operator binding records the portal association; live graph metadata, contract, queryable types/endpoints, and native responses are checked for consistency. Native reads use GET graphModels/{id}/getQueryableGraphType?beta=true and POST graphModels/{id}/executeQuery?beta=true with a query body, following opaque string result.nextPage continuations. Errors, warnings, truncation, malformed or dangling results, and limits exceeding 2,000 nodes or 4,000 edges fail closed without partial topology. Optional agent blocks remain unchanged; no verified Operations Agent playbook generation contract is claimed. Current live testing is restricted to ws-vteam-demoV3 in tenant ad340c84-1886-4202-a483-2da2cb9168eb, is in progress, and supplies no new native graph evidence or app deployment claim. See docs/knowledge-graph.md for the canonical contract.</w:t>
       </w:r>
     </w:p>
     <w:p>

</xml_diff>

<commit_message>
fix: restore complete agent workflows for ontology v2
Restore Operations Agent business configuration, playbooks and alert pipeline. Require real agent provisioning by default and propagate failures. Preserve timestamp bindings and compatible physical relationship identities, validate telemetry mappings, repair scoped discovery, and update contracts, tests and documentation.

Co-authored-by: Copilot <223556219+Copilot@users.noreply.github.com>
</commit_message>
<xml_diff>
--- a/Raw/RTI_Notebooks/RTI_Ontology_Workflow_clean.docx
+++ b/Raw/RTI_Notebooks/RTI_Ontology_Workflow_clean.docx
@@ -386,7 +386,7 @@
               <w:rPr>
                 <w:sz w:val="18"/>
               </w:rPr>
-              <w:t>Dashboard / gated Data Agent / blocked Operations Agent / independent SQL and GraphQL setup. See readiness rules below.</w:t>
+              <w:t>Dashboard / default-enabled Data Agent and Operations Agent / playbook, actions, Teams, and email-alert provisioning / SQL and GraphQL setup. See readiness rules below.</w:t>
             </w:r>
           </w:p>
         </w:tc>
@@ -453,40 +453,22 @@
       </w:pPr>
       <w:r>
         <w:t>rti_demo_settings includes:</w:t>
-      </w:r>
-      <w:r>
         <w:br/>
         <w:t>workspace_id</w:t>
-      </w:r>
-      <w:r>
         <w:br/>
         <w:t>workspace_folder_path</w:t>
-      </w:r>
-      <w:r>
         <w:br/>
         <w:t>target_folder_id</w:t>
-      </w:r>
-      <w:r>
         <w:br/>
         <w:t>lakehouse_name / lakehouse_id</w:t>
-      </w:r>
-      <w:r>
         <w:br/>
         <w:t>ontology_name</w:t>
-      </w:r>
-      <w:r>
         <w:br/>
         <w:t>eventhouse_name / kql_database_name / eventhouse_table_name</w:t>
-      </w:r>
-      <w:r>
         <w:br/>
         <w:t>eventstream_name</w:t>
-      </w:r>
-      <w:r>
         <w:br/>
         <w:t>silver table names</w:t>
-      </w:r>
-      <w:r>
         <w:br/>
         <w:t>Key Vault settings</w:t>
       </w:r>
@@ -567,8 +549,6 @@
       </w:pPr>
       <w:r>
         <w:t>Sensor identity:</w:t>
-      </w:r>
-      <w:r>
         <w:br/>
         <w:t>opcua_node_id</w:t>
       </w:r>
@@ -635,24 +615,14 @@
       </w:pPr>
       <w:r>
         <w:t>Core silver tables:</w:t>
-      </w:r>
-      <w:r>
         <w:br/>
         <w:t>silver_facilities</w:t>
-      </w:r>
-      <w:r>
         <w:br/>
         <w:t>silver_systems</w:t>
-      </w:r>
-      <w:r>
         <w:br/>
         <w:t>silver_equipment</w:t>
-      </w:r>
-      <w:r>
         <w:br/>
         <w:t>silver_instruments</w:t>
-      </w:r>
-      <w:r>
         <w:br/>
         <w:t>silver_signal_master</w:t>
       </w:r>
@@ -665,40 +635,22 @@
       </w:pPr>
       <w:r>
         <w:t>silver_signal_master contains static signal metadata:</w:t>
-      </w:r>
-      <w:r>
         <w:br/>
         <w:t>opcua_node_id</w:t>
-      </w:r>
-      <w:r>
         <w:br/>
         <w:t>tag</w:t>
-      </w:r>
-      <w:r>
         <w:br/>
         <w:t>instrument_id</w:t>
-      </w:r>
-      <w:r>
         <w:br/>
         <w:t>equipment_id</w:t>
-      </w:r>
-      <w:r>
         <w:br/>
         <w:t>system_id</w:t>
-      </w:r>
-      <w:r>
         <w:br/>
         <w:t>facility_id</w:t>
-      </w:r>
-      <w:r>
         <w:br/>
         <w:t>unit</w:t>
-      </w:r>
-      <w:r>
         <w:br/>
         <w:t>is_active</w:t>
-      </w:r>
-      <w:r>
         <w:br/>
         <w:t>signal_type</w:t>
       </w:r>
@@ -794,26 +746,14 @@
       </w:pPr>
       <w:r>
         <w:t>Entity identity keys:</w:t>
-      </w:r>
-      <w:r>
         <w:br/>
         <w:t>facilities      -&gt; facility_id</w:t>
-      </w:r>
-      <w:r>
         <w:br/>
         <w:t>systems         -&gt; system_id</w:t>
-      </w:r>
-      <w:r>
         <w:br/>
-      </w:r>
-      <w:r>
         <w:t>equipment       -&gt; equipment_id</w:t>
-      </w:r>
-      <w:r>
         <w:br/>
         <w:t>instruments     -&gt; instrument_id</w:t>
-      </w:r>
-      <w:r>
         <w:br/>
         <w:t>signal_master   -&gt; opcua_node_id</w:t>
       </w:r>
@@ -826,12 +766,8 @@
       </w:pPr>
       <w:r>
         <w:t>signal_master:</w:t>
-      </w:r>
-      <w:r>
         <w:br/>
         <w:t>static properties from silver_signal_master</w:t>
-      </w:r>
-      <w:r>
         <w:br/>
         <w:t>time-series properties: event_time, value, quality</w:t>
       </w:r>
@@ -912,24 +848,14 @@
       </w:pPr>
       <w:r>
         <w:t>Static bindings:</w:t>
-      </w:r>
-      <w:r>
         <w:br/>
         <w:t>facilities      -&gt; silver_facilities</w:t>
-      </w:r>
-      <w:r>
         <w:br/>
         <w:t>systems         -&gt; silver_systems</w:t>
-      </w:r>
-      <w:r>
         <w:br/>
         <w:t>equipment       -&gt; silver_equipment</w:t>
-      </w:r>
-      <w:r>
         <w:br/>
         <w:t>instruments     -&gt; silver_instruments</w:t>
-      </w:r>
-      <w:r>
         <w:br/>
         <w:t>signal_master   -&gt; silver_signal_master</w:t>
       </w:r>
@@ -969,7 +895,7 @@
         <w:t xml:space="preserve">• </w:t>
       </w:r>
       <w:r>
-        <w:t>Uses opcua_node_id as the shared identity and event_time as the time-series timestamp, with value and quality as telemetry properties.</w:t>
+        <w:t>Uses opcua_node_id as the shared identity and event_time as both the time-series timestamp and a standalone bound property, with value and quality as telemetry properties.</w:t>
       </w:r>
     </w:p>
     <w:p>
@@ -1026,20 +952,12 @@
       </w:pPr>
       <w:r>
         <w:t>Eventhouse table OPCUAEvents is intentionally slim:</w:t>
-      </w:r>
-      <w:r>
         <w:br/>
         <w:t>event_time</w:t>
-      </w:r>
-      <w:r>
         <w:br/>
         <w:t>opcua_node_id</w:t>
-      </w:r>
-      <w:r>
         <w:br/>
         <w:t>value</w:t>
-      </w:r>
-      <w:r>
         <w:br/>
         <w:t>quality</w:t>
       </w:r>
@@ -1105,20 +1023,12 @@
       </w:pPr>
       <w:r>
         <w:t>Eventhouse source column -&gt; Ontology target</w:t>
-      </w:r>
-      <w:r>
         <w:br/>
         <w:t>opcua_node_id       -&gt; signal_master.opcua_node_id</w:t>
-      </w:r>
-      <w:r>
         <w:br/>
         <w:t>event_time          -&gt; signal_master.event_time</w:t>
-      </w:r>
-      <w:r>
         <w:br/>
         <w:t>value               -&gt; signal_master.value</w:t>
-      </w:r>
-      <w:r>
         <w:br/>
         <w:t>quality             -&gt; signal_master.quality</w:t>
       </w:r>
@@ -1139,33 +1049,17 @@
       </w:pPr>
       <w:r>
         <w:t>Lakehouse</w:t>
-      </w:r>
-      <w:r>
         <w:br/>
         <w:t xml:space="preserve">  silver_signal_master = static signal metadata</w:t>
-      </w:r>
-      <w:r>
         <w:br/>
-      </w:r>
-      <w:r>
         <w:br/>
         <w:t>Eventhouse</w:t>
-      </w:r>
-      <w:r>
         <w:br/>
         <w:t xml:space="preserve">  OPCUAEvents = slim telemetry rows</w:t>
-      </w:r>
-      <w:r>
         <w:br/>
-      </w:r>
-      <w:r>
         <w:br/>
         <w:t>Ontology v2</w:t>
-      </w:r>
-      <w:r>
         <w:br/>
-      </w:r>
-      <w:r>
         <w:t xml:space="preserve">  signal_master joins both layers by opcua_node_id</w:t>
       </w:r>
     </w:p>
@@ -1193,15 +1087,15 @@
         <w:rPr>
           <w:b/>
         </w:rPr>
-        <w:t xml:space="preserve">009 - Data Agent capability gate. </w:t>
+        <w:t xml:space="preserve">009 - Data Agent provisioning. </w:t>
       </w:r>
       <w:r>
-        <w:t>ontology_data_agent_mode=auto remains blocked for the v2 rollout; auto is not a readiness claim. disabled skips agent integration. enabled is an explicit attempt, not a guarantee that the tenant supports the v2 source contract.</w:t>
+        <w:t>ontology_data_agent_mode defaults to enabled. auto is a backward-compatible alias that also attempts actual provisioning, not a static blocked result. Only explicit disabled skips agent integration. Neither enabled nor auto guarantees tenant support for the v2 source contract; required failures propagate through notebook and setup.</w:t>
       </w:r>
     </w:p>
     <w:p>
       <w:r>
-        <w:t>An enabled Data Agent attempt requires a verified live generation-2 ontology and the exact selected ontology ID/workspace in the agent source. Strict draft and published readbacks must retain that identity before success is reported. Existing legacy or unrelated sources are rejected, not silently reused or deleted; authentication, API, schema, readback, and publication errors propagate.</w:t>
+        <w:t>An enabled Data Agent attempt requires a verified live generation-2 ontology and the exact selected ontology ID/workspace in the agent source. Strict draft and published readbacks must retain that identity before success is reported as data_agent_deployment_status=published. Existing legacy or unrelated sources are rejected, not silently reused or deleted; authentication, API, schema, readback, and publication errors propagate.</w:t>
       </w:r>
     </w:p>
     <w:p>
@@ -1209,10 +1103,10 @@
         <w:rPr>
           <w:b/>
         </w:rPr>
-        <w:t xml:space="preserve">010 - Operations Agent blocked. </w:t>
+        <w:t xml:space="preserve">010 - Operations Agent and alerts. </w:t>
       </w:r>
       <w:r>
-        <w:t>Automation remains blocked pending a verified v2 playbook contract and resolution of known issue 1970. auto records the unsupported capability without claiming readiness; disabled skips the feature; enabled fails before writes. The old embedded playbook has been removed. No automatic Operations Agent alert pipeline is provisioned.</w:t>
+        <w:t>ontology_operations_agent_mode defaults to enabled; auto also attempts actual provisioning and only disabled opts out. The original Operations Agent, playbook/actions, Teams configuration, and Pipe_SendEmailAlert provisioning are retained against the verified v2 ontology. Required failures propagate, not successful static skips. Configure the run-as identity and Teams destination; email delivery requires the manually created Office 365 Outlook OAuth2 mailbox connection. Strict readback records ops_agent_deployment_status=configured with the agent stopped, not runtime tested. OperationsAgentV1 names the retained business-configuration schema, not ontology generation 1. Item creation is not proof of playbook execution or alert delivery. Known issue 1970 and other external product issues are not claimed resolved by restoring this implementation.</w:t>
       </w:r>
     </w:p>
     <w:p>
@@ -1220,15 +1114,15 @@
         <w:rPr>
           <w:b/>
         </w:rPr>
-        <w:t xml:space="preserve">011 - Independent SQL and GraphQL setup. </w:t>
+        <w:t xml:space="preserve">011 - SQL, GraphQL, and Data Agent sources. </w:t>
       </w:r>
       <w:r>
-        <w:t>With the application SQL database and tables already present, this notebook seeds operational SQL data and wires the Lakehouse GraphQL endpoint independently of Data Agent availability. It does not deploy the app.</w:t>
+        <w:t>With the application SQL database and tables already present, this notebook seeds operational SQL data, wires the Lakehouse GraphQL endpoint, and extends the required Data Agent with SQL unless explicitly disabled. SQL/GraphQL writes can precede an agent failure; they do not turn a failed required extension into a successful job. This notebook does not deploy the app.</w:t>
       </w:r>
     </w:p>
     <w:p>
       <w:r>
-        <w:t>The optional SQL-source addition honors the Data Agent mode. An enabled attempt verifies the selected v2 ontology identity and submitted SQL source in the draft, then verifies both published counterparts before reporting success. Errors propagate; a skipped or blocked agent step must not be described as published or ready.</w:t>
+        <w:t>The SQL-source addition honors the Data Agent mode. enabled and auto require prior RTI_009 published status, verify the selected v2 ontology identity and submitted SQL source in the draft, then verify both published counterparts before reporting success. Missing/ineligible required agents and extension errors propagate. Only disabled permits a successful SQL/GraphQL-only run, which must not be described as full agent readiness. The setup orchestrator requires NB09 published and NB10 configured, except for explicitly disabled agents with skipped status.</w:t>
       </w:r>
     </w:p>
     <w:p>
@@ -1246,7 +1140,7 @@
     </w:p>
     <w:p>
       <w:r>
-        <w:t>Configure RAYFIN_PUBLIC_ONTOLOGY_GRAPH_BINDING JSON with workspaceId, ontologyId, and graphModelId. Optional nodeTypes and edgeTypes map getQueryableGraphType aliases to exact ontology type names or IDs when labels differ; the namespace-label delimiter is undocumented and must not be guessed. Public REST metadata does not expose ownership: matching names, a sole graph, or structural similarity are not proof. The operator binding records the portal association; live graph metadata, contract, queryable types/endpoints, and native responses are checked for consistency. Native reads use GET graphModels/{id}/getQueryableGraphType?beta=true and POST graphModels/{id}/executeQuery?beta=true with a query body, following opaque string result.nextPage continuations. Errors, warnings, truncation, malformed or dangling results, and limits exceeding 2,000 nodes or 4,000 edges fail closed without partial topology. Optional agent blocks remain unchanged; no verified Operations Agent playbook generation contract is claimed. Current live testing is restricted to ws-vteam-demoV3 in tenant ad340c84-1886-4202-a483-2da2cb9168eb, is in progress, and supplies no new native graph evidence or app deployment claim. See docs/knowledge-graph.md for the canonical contract.</w:t>
+        <w:t>Configure RAYFIN_PUBLIC_ONTOLOGY_GRAPH_BINDING JSON with workspaceId, ontologyId, and graphModelId. Optional nodeTypes and edgeTypes map getQueryableGraphType aliases to exact ontology type names or IDs when labels differ; the namespace-label delimiter is undocumented and must not be guessed. Public REST metadata does not expose ownership: matching names, a sole graph, or structural similarity are not proof. The operator binding records the portal association; live graph metadata, contract, queryable types/endpoints, and native responses are checked for consistency. Native reads use GET graphModels/{id}/getQueryableGraphType?beta=true and POST graphModels/{id}/executeQuery?beta=true with a query body, following opaque string result.nextPage continuations. Errors, warnings, truncation, malformed or dangling results, and limits exceeding 2,000 nodes or 4,000 edges fail closed without partial topology. The observed full five-entity graph-projection blocker remains unresolved. Existing live evidence is historical core-only acceptance; 65 graph tests passed before this restoration, not as current full end-to-end certification. A new live attempt of the restored agent/playbook/action/Teams/email flow is pending in ws-vteam-demoV3, tenant ad340c84-1886-4202-a483-2da2cb9168eb. See docs/knowledge-graph.md for the canonical contract.</w:t>
       </w:r>
     </w:p>
     <w:p>
@@ -1274,7 +1168,7 @@
     </w:p>
     <w:p>
       <w:r>
-        <w:t>Certification boundary: recent work did not deploy applications or agents. Full Spark pipeline execution and browser end-to-end behavior are not certified. Ontology definition/readback checks must not be presented as completion of those separate tests.</w:t>
+        <w:t>Certification boundary: the capability-parity restoration does not certify live agents, alerts, or browser end-to-end behavior. Historical core-only deployment evidence remains valid only for its recorded scope. Verify the default-enabled RTI_009/010/011 flow, required-failure propagation, playbook execution, and actual Teams/email delivery in a new live attempt. Ontology definition/readback checks are not substitutes for those tests.</w:t>
       </w:r>
     </w:p>
     <w:p>

</xml_diff>

<commit_message>
fix: require functional ontology readiness without removing agent capabilities
Separate Data Agent publication from runtime readiness, reject semantic MCP failures even in successful envelopes, and propagate required failures through notebook and setup contracts. Preserve SQL sources, custom instructions and selections during failing reruns. Record actual V3 validation and remaining platform limitations.

Co-authored-by: Copilot <223556219+Copilot@users.noreply.github.com>
</commit_message>
<xml_diff>
--- a/Raw/RTI_Notebooks/RTI_Ontology_Workflow_clean.docx
+++ b/Raw/RTI_Notebooks/RTI_Ontology_Workflow_clean.docx
@@ -1095,7 +1095,7 @@
     </w:p>
     <w:p>
       <w:r>
-        <w:t>An enabled Data Agent attempt requires a verified live generation-2 ontology and the exact selected ontology ID/workspace in the agent source. Strict draft and published readbacks must retain that identity before success is reported as data_agent_deployment_status=published. Existing legacy or unrelated sources are rejected, not silently reused or deleted; authentication, API, schema, readback, and publication errors propagate.</w:t>
+        <w:t>An enabled Data Agent attempt requires a verified live generation-2 ontology and the exact selected ontology ID/workspace in the agent source. Strict draft and published readbacks must retain that identity for data_agent_publication_status=published, independent of runtime. A successful bounded facility-record smoke check sets data_agent_deployment_status=ready and data_agent_runtime_status=verified. This check does not attest execution provenance or certify SQL/combined-source answers or the whole agent. The revised notebook was executed once and correctly failed on the real unsupported-Ontology-API semantic error; this validates failure handling, not healthy ontology runtime. Authentication, API, schema, readback, publication, and failed or inconclusive functional checks must fail required execution.</w:t>
       </w:r>
     </w:p>
     <w:p>
@@ -1122,7 +1122,7 @@
     </w:p>
     <w:p>
       <w:r>
-        <w:t>The SQL-source addition honors the Data Agent mode. enabled and auto require prior RTI_009 published status, verify the selected v2 ontology identity and submitted SQL source in the draft, then verify both published counterparts before reporting success. Missing/ineligible required agents and extension errors propagate. Only disabled permits a successful SQL/GraphQL-only run, which must not be described as full agent readiness. The setup orchestrator requires NB09 published and NB10 configured, except for explicitly disabled agents with skipped status.</w:t>
+        <w:t>The SQL-source addition honors the Data Agent mode. enabled and auto require prior RTI_009 deployment/publication/runtime statuses ready/published/verified and matching evidence for the agent/workspace/ontology plus exact ontology source configuration. NB11 filters the ontology subset of multi-source evidence: adding SQL alone does not invalidate the smoke evidence if that source configuration is retained. Changed ontology configuration is inconclusive and fails required execution. NB11 verifies ontology and submitted SQL source in draft and published readback; required failures propagate after independent SQL/GraphQL outcomes are persisted. Only disabled permits SQL/GraphQL-only success. NB10 remains configured/stopped. The revised NB09 failure path was validated live; NB11 and full setup were not executed during that bounded validation.</w:t>
       </w:r>
     </w:p>
     <w:p>
@@ -1140,7 +1140,7 @@
     </w:p>
     <w:p>
       <w:r>
-        <w:t>Configure RAYFIN_PUBLIC_ONTOLOGY_GRAPH_BINDING JSON with workspaceId, ontologyId, and graphModelId. Optional nodeTypes and edgeTypes map getQueryableGraphType aliases to exact ontology type names or IDs when labels differ; the namespace-label delimiter is undocumented and must not be guessed. Public REST metadata does not expose ownership: matching names, a sole graph, or structural similarity are not proof. The operator binding records the portal association; live graph metadata, contract, queryable types/endpoints, and native responses are checked for consistency. Native reads use GET graphModels/{id}/getQueryableGraphType?beta=true and POST graphModels/{id}/executeQuery?beta=true with a query body, following opaque string result.nextPage continuations. Errors, warnings, truncation, malformed or dangling results, and limits exceeding 2,000 nodes or 4,000 edges fail closed without partial topology. The observed full five-entity graph-projection blocker remains unresolved. Existing live evidence is historical core-only acceptance; 65 graph tests passed before this restoration, not as current full end-to-end certification. A new live attempt of the restored agent/playbook/action/Teams/email flow is pending in ws-vteam-demoV3, tenant ad340c84-1886-4202-a483-2da2cb9168eb. See docs/knowledge-graph.md for the canonical contract.</w:t>
+        <w:t>Configure RAYFIN_PUBLIC_ONTOLOGY_GRAPH_BINDING JSON with workspaceId, ontologyId, and graphModelId. Optional nodeTypes and edgeTypes map getQueryableGraphType aliases to exact ontology type names or IDs when labels differ; the namespace-label delimiter is undocumented and must not be guessed. Public REST metadata does not expose ownership: matching names, a sole graph, or structural similarity are not proof. The operator binding records the portal association; live graph metadata, contract, queryable types/endpoints, and native responses are checked for consistency. Native reads use GET graphModels/{id}/getQueryableGraphType?beta=true and POST graphModels/{id}/executeQuery?beta=true with a query body, following opaque string result.nextPage continuations. Errors, warnings, truncation, malformed or dangling results, and limits exceeding 2,000 nodes or 4,000 edges fail closed without partial topology. The observed full five-entity graph-projection blocker remains unresolved. Earlier core-only acceptance and 65 graph tests passed before restoration remain historical evidence, not current full end-to-end certification. Later bounded live attempts are recorded below for ws-vteam-demoV3, tenant ad340c84-1886-4202-a483-2da2cb9168eb. See docs/knowledge-graph.md for the complete historical and current records.</w:t>
       </w:r>
     </w:p>
     <w:p>
@@ -1168,7 +1168,75 @@
     </w:p>
     <w:p>
       <w:r>
-        <w:t>Certification boundary: the capability-parity restoration does not certify live agents, alerts, or browser end-to-end behavior. Historical core-only deployment evidence remains valid only for its recorded scope. Verify the default-enabled RTI_009/010/011 flow, required-failure propagation, playbook execution, and actual Teams/email delivery in a new live attempt. Ontology definition/readback checks are not substitutes for those tests.</w:t>
+        <w:t>Certification boundary: source publication, stopped-agent configuration, and native API/model checks do not certify semantic runtime, alerts, or browser end-to-end behavior. Historical core-only deployment evidence remains valid only for its recorded scope. The updated required NB09 failure-path validation passed because the job correctly failed on the actual semantic error while preserving multi-source content; ontology runtime remains blocked. Playbook activation, monitoring, action execution, and actual Teams/email delivery remain unverified.</w:t>
+      </w:r>
+    </w:p>
+    <w:p>
+      <w:pPr>
+        <w:pStyle w:val="Heading1"/>
+      </w:pPr>
+      <w:r>
+        <w:t>Latest V3 acceptance - September 30, 2026</w:t>
+      </w:r>
+    </w:p>
+    <w:p>
+      <w:r>
+        <w:t>Corrective commit 8ac32e0 and live-proven Operations Agent action-type correction 70f99a4 were pushed to feat/dibakar only, not main. These results supersede earlier item identities without rewriting the historical evidence. Run identifiers below are prefixes where abbreviated; times are the reported run times.</w:t>
+      </w:r>
+    </w:p>
+    <w:p>
+      <w:r>
+        <w:t>Current ontology: 0e34df51-28bd-44db-93d0-71d90bcffbf8. Ontology-managed graph: 1243b115-ca47-417a-8886-ccb7c2f16b68. Data Agent: 2fa36931-2ddd-459b-9803-a45cb8cd13ae. Operations Agent: 16024bc3-1c4f-4094-ab36-a2cfb0964987. STID GraphQL: 33b7c87b-e707-439f-a197-e734d3045ba0.</w:t>
+      </w:r>
+    </w:p>
+    <w:p>
+      <w:r>
+        <w:t>The full five-entity projection still returned HTTP 400: event_time, value, and quality projected as INVALID TimeSeries properties. The selected four-entity/three-relationship graph refresh (prefix ff0d8113) completed at 15:58. The ontology retained all five entities, four relationships, and all three time-series backings; only the graph projection excludes signal_master.</w:t>
+      </w:r>
+    </w:p>
+    <w:p>
+      <w:r>
+        <w:t>After deployment, the actual production application parsers and graph model passed against the new ontology and graph: 111 native nodes / 108 edges, real KQL readings for 90 signals, and a fresh SQL export produced 174 combined nodes / 171 edges and three facility scopes of 58 nodes each. STID topology inputs were empty. This is API/model evidence, not interactive graph rendering or CRUD acceptance.</w:t>
+      </w:r>
+    </w:p>
+    <w:p>
+      <w:r>
+        <w:t>Weather run prefix eed6c26b completed at 16:08 with 516 forecasts, 405 observations, 516 metrics, and serving tables of 120 forecasts / 69 observations. Stream run prefix fb83f3f5 completed at 16:19 with 9,002 rows across 90 signals. RTI_011 run prefix 190fbd8a completed at 16:26: SQL and GraphQL succeeded, and five selected SQL tables were verified in the published Data Agent definition. This does not prove ontology runtime.</w:t>
+      </w:r>
+    </w:p>
+    <w:p>
+      <w:r>
+        <w:t>A pre-update Data Agent MCP ontology question failed inside analyze_ontology with API version not supported despite HTTP 200 and an isError: false envelope (RootActivityId 5082e3f9-6b1e-45a5-b675-acfe7d8660e2). That historical flag is not functional success. A separate SQL-only MCP question correctly returned 12 work orders. Neither SQL success nor source publication certifies semantic runtime. The revised check has 58 focused offline tests and 102/102 parent-run full ontology regressions on Python 3.12 reported passing. The later authorized live failure-path result is recorded below; it is not a healthy ontology smoke result.</w:t>
+      </w:r>
+    </w:p>
+    <w:p>
+      <w:r>
+        <w:t>Bounded smoke contract: NB09 requests only the selected ontology’s first five facility IDs/names, without putting expected values in the prompt, and compares exact records with independently read configured Lakehouse rows. Attached SQL sources are permitted and preserved; no cached proof is needed. Successful evidence uses verification=ontology_facilities_smoke_v1 and scope “Source-specific functional smoke test; execution provenance is not attested.” This is not cryptographic provenance, full agent certification, or SQL/combined-source readiness. Semantic errors (including nested JSON errors despite isError: false), wrong rows, and transport failures are failed; nonparseable, count-only, or unverifiable answers are inconclusive. Both fail required NB09/NB11/setup. Existing SQL/custom parts, operational/custom instructions, and entity selections survive even runtime-failing NB09 reruns. Failure-path validation passed; the ontology smoke itself did not pass.</w:t>
+      </w:r>
+    </w:p>
+    <w:p>
+      <w:r>
+        <w:t>Authorized live NB09 validation: only NB09, NB11, and setup orchestrator definitions were updated, with exact readbacks preserving metadata, attachments, parameter/configure cells, and all other parts. Only NB09 was executed, once: job b1818634-f77e-4dec-ab55-982460ecb101, September 30, 2026, 17:04:17.981Z to 17:10:55.532Z. It correctly FAILED at required readiness: “Data Agent published but ontology runtime failed: The request is invalid. This API version is not supported for the specified Ontology item.” RootActivityId 860accc8-feb7-4717-a44f-53fcf172b7c6; MCP tools/call request ef7abc1e-2b91-42ed-82d5-9ca002855319. Initialize/list/call all returned HTTP 200; the actual isError: false semantic error was detected correctly.</w:t>
+      </w:r>
+    </w:p>
+    <w:p>
+      <w:r>
+        <w:t>Persisted Delta readback confirmed mode enabled, data_agent_deployment_status=failed, data_agent_publication_status=published, data_agent_runtime_status=failed, and data_agent_sql_source_status=published. The complete 16,216-character runtime evidence was valid JSON, verified from active Delta snapshot 23 through read-only OneLake; the SQL endpoint inspection read truncated it at 8,000 characters and was not used to certify completeness. Draft AND published definitions retained ontology/SQL identities, all five SQL tables, all five ontology elements, exact custom instructions/selections, and other capability content. Only publish_info.description changed from the NB11 publication note to the NB09 note; .platform and every other part were equal. After failure, SQL-only MCP still returned exactly {"workOrderCount":12}, isError: false, with no semantic error. This proves truthful required failure and preservation, not healthy ontology runtime. No retry, full setup, NB11 execution, activation, sends, reset, or further source changes occurred in this bounded validation.</w:t>
+      </w:r>
+    </w:p>
+    <w:p>
+      <w:r>
+        <w:t>The initial Operations Agent request returned HTTP 400 for action type DataPipeline. Changing only that enum to the original Pipeline yielded HTTP 200 while retaining the full business configuration. RTI_010 rerun prefix 018e1356 completed with the agent configured and stopped. The actual Operations Agent UI displayed instructions, selected ontology source, connected email action, and authored BAD/UNCERTAIN rules. No activation, monitoring, action execution, or Teams/email sends were verified. OperationsAgentV1 remains the agent configuration format, not Ontology v1; no product-wide runtime fix is claimed.</w:t>
+      </w:r>
+    </w:p>
+    <w:p>
+      <w:r>
+        <w:t>The canonical application deployment reported SUCCESS at 16:06 at https://icy-twist-acc301b27a-swedencentral.webapp.fabricapps.net. Backend/SQL checks passed and all 32 existing SPA redirects were preserved. Hosting remained protected by its sign-in gate, and the separate authentication popup prevented interactive application acceptance. Earlier hosted browser evidence does not certify this new deployment.</w:t>
+      </w:r>
+    </w:p>
+    <w:p>
+      <w:r>
+        <w:t>Update boundary: an earlier full PreferRemote Git import removed generated resources, later restored through setup. Do not repeat a full Git import for these corrections. Subsequent changes use bounded notebook-definition updates. These acceptance records do not authorize another reset, import, deployment, or alert send.</w:t>
       </w:r>
     </w:p>
     <w:p>

</xml_diff>

<commit_message>
Align packaged workflows with mandatory Spark Runtime 2.0
Co-authored-by: Copilot <223556219+Copilot@users.noreply.github.com>
</commit_message>
<xml_diff>
--- a/Raw/RTI_Notebooks/RTI_Ontology_Workflow_clean.docx
+++ b/Raw/RTI_Notebooks/RTI_Ontology_Workflow_clean.docx
@@ -44,6 +44,11 @@
     <w:p>
       <w:r>
         <w:t>Canonical RTI_004_build_ontology_mapping_rti_structured, RTI_005_entity_DataBinding_rti_structured, and RTI_006_TimeSeriesBinding_RTI_signal notebook names remain unchanged. Generation is determined from live metadata and TMDL, not filenames.</w:t>
+      </w:r>
+    </w:p>
+    <w:p>
+      <w:r>
+        <w:t>All Spark notebooks, including every Weather notebook, require Fabric Runtime 2.0 (Spark 4.1 / Python 3.13), with no older-runtime exceptions or downgrade fallback. The local deployer sets and verifies the workspace default and verifies every published Environment override before starting setup. Weather uses its published Runtime 2.0 Environment and the Python-3.13-compatible library pins tracked in the repository.</w:t>
       </w:r>
     </w:p>
     <w:tbl>
@@ -188,7 +193,7 @@
               <w:rPr>
                 <w:sz w:val="18"/>
               </w:rPr>
-              <w:t>Sets up the Eventhouse, KQL database, and telemetry table.</w:t>
+              <w:t>Sets up the Eventhouse, KQL database, telemetry table and Eventstream. Waits for asynchronous Eventstream creation/update operations and verifies endpoint readiness before saving settings.</w:t>
             </w:r>
           </w:p>
         </w:tc>

</xml_diff>

<commit_message>
Bootstrap independent hosted sources before fresh Foundry deployment
Co-authored-by: Copilot <223556219+Copilot@users.noreply.github.com>
</commit_message>
<xml_diff>
--- a/Raw/RTI_Notebooks/RTI_Ontology_Workflow_clean.docx
+++ b/Raw/RTI_Notebooks/RTI_Ontology_Workflow_clean.docx
@@ -1122,12 +1122,12 @@
         <w:t xml:space="preserve">011 - SQL, GraphQL, and Data Agent sources. </w:t>
       </w:r>
       <w:r>
-        <w:t>With the application SQL database and tables already present, this notebook seeds operational SQL data, wires the Lakehouse GraphQL endpoint, and extends the required Data Agent with SQL unless explicitly disabled. SQL/GraphQL writes can precede an agent failure; they do not turn a failed required extension into a successful job. This notebook does not deploy the app.</w:t>
+        <w:t>With the AppBackend SQL database and tables already present, NB11 always configures independent Lakehouse GraphQL and extends the Data Agent with SQL. A fresh canonical app deployment calls it before Foundry with Boolean seed_demo_data=False, preserving operational records and previous demo-seed status. Explicit Seed &amp; provision retains the default demo MERGE. The SPA reads Lakehouse data through its connector, not this separate hosted-crew GraphQL API. This notebook does not itself publish the app.</w:t>
       </w:r>
     </w:p>
     <w:p>
       <w:r>
-        <w:t>The SQL-source addition honors the Data Agent mode. enabled and auto require prior RTI_009 deployment/publication/runtime statuses ready/published/verified and matching evidence for the agent/workspace/ontology plus exact ontology source configuration. NB11 filters the ontology subset of multi-source evidence: adding SQL alone does not invalidate the smoke evidence if that source configuration is retained. Changed ontology configuration is inconclusive and fails required execution. NB11 verifies ontology and submitted SQL source in draft and published readback; required failures propagate after independent SQL/GraphQL outcomes are persisted. Only disabled permits SQL/GraphQL-only success. NB10 remains configured/stopped. The revised NB09 failure path was validated live; NB11 and full setup were not executed during that bounded validation.</w:t>
+        <w:t>SQL-source publication is mandatory and independent of NB09 runtime status; there are no agent mode or skip branches. NB11 preserves compatible SQL/custom content and verifies submitted SQL sources in draft and published readback. Failures propagate after independent outcomes are persisted. Before a source-only bootstrap, the deployer verifies the live notebook code, idle state and Runtime 2.0, bounds the job wait to 15 minutes, and refreshes the verified GraphQL identity. Ordinary deployments with an existing verified GraphQL ID avoid this extra run. NB10 remains configured/stopped; publication and hosting do not certify execution, joins or delivery.</w:t>
       </w:r>
     </w:p>
     <w:p>

</xml_diff>

<commit_message>
Build and verify complete ontology before publishing Fabric agents
Prepare SQL and initial weather sources before agent provisioning, validate complete source-backed bindings and relationships, preserve standalone operational bootstrap, and align local deployment guidance.

Co-authored-by: Copilot <223556219+Copilot@users.noreply.github.com>
</commit_message>
<xml_diff>
--- a/Raw/RTI_Notebooks/RTI_Ontology_Workflow_clean.docx
+++ b/Raw/RTI_Notebooks/RTI_Ontology_Workflow_clean.docx
@@ -1095,12 +1095,12 @@
         <w:t xml:space="preserve">009 - Data Agent provisioning. </w:t>
       </w:r>
       <w:r>
-        <w:t>ontology_data_agent_mode defaults to enabled. auto is a backward-compatible alias that also attempts actual provisioning, not a static blocked result. Only explicit disabled skips agent integration. Neither enabled nor auto guarantees tenant support for the v2 source contract; required failures propagate through notebook and setup.</w:t>
+        <w:t>Always provision the Data Agent and ontology-backed Operations Agent; there are no agent mode flags or skip branches. Core bindings and the initial standard UKMet refresh precede NB11 model preparation. The complete baseline has 16 meaningful business entity types and 21 required relationships, including operational SQL, weather-to-facility links and EquipmentType part-category eligibility. Compatible custom additions remain preserved. Both agents require successful model preparation and recheck the selected live definition before publication.</w:t>
       </w:r>
     </w:p>
     <w:p>
       <w:r>
-        <w:t>An enabled Data Agent attempt requires a verified live generation-2 ontology and the exact selected ontology ID/workspace in the agent source. Strict draft and published readbacks must retain that identity for data_agent_publication_status=published, independent of runtime. A successful bounded facility-record smoke check sets data_agent_deployment_status=ready and data_agent_runtime_status=verified. This check does not attest execution provenance or certify SQL/combined-source answers or the whole agent. The revised notebook was executed once and correctly failed on the real unsupported-Ontology-API semantic error; this validates failure handling, not healthy ontology runtime. Authentication, API, schema, readback, publication, and failed or inconclusive functional checks must fail required execution.</w:t>
+        <w:t>The Data Agent requires verified live numeric generation 2 and the exact selected ontology ID/workspace in its source. Strict draft and published readbacks retain this identity for data_agent_publication_status=published, independent of runtime. A bounded facility-record smoke check records only its exact functional scope; it does not attest execution provenance, SQL/combined-source answers or the whole agent. Only the exact Fabric response “This API version is not supported for the specified Ontology item” after verified publication is a known non-ready product limitation. Other authentication, API, schema, readback, publication and failed or inconclusive runtime checks propagate. An agent failure cannot prevent building the complete ontology.</w:t>
       </w:r>
     </w:p>
     <w:p>
@@ -1119,15 +1119,15 @@
         <w:rPr>
           <w:b/>
         </w:rPr>
-        <w:t xml:space="preserve">011 - SQL, GraphQL, and Data Agent sources. </w:t>
+        <w:t xml:space="preserve">011 - Complete ontology, operational SQL, and Data Agent sources. </w:t>
       </w:r>
       <w:r>
-        <w:t>With the AppBackend SQL database and tables already present, NB11 always configures independent Lakehouse GraphQL and extends the Data Agent with SQL. A fresh canonical app deployment calls it before Foundry with Boolean seed_demo_data=False, preserving operational records and previous demo-seed status. Explicit Seed &amp; provision retains the default demo MERGE. The SPA reads Lakehouse data through its connector, not this separate hosted-crew GraphQL API. This notebook does not itself publish the app.</w:t>
+        <w:t>Stage 1 provisions the independent operational Fabric SQLDatabase, not an app-owned database. Stage 2 invokes NB11 with setup_phase=“model” after core binding and initial UKMet ingestion, before either agent. It inserts only missing demo rows, validates actual operational asset/signal/instrument keys and weather relationships/current eligible-facility forecast coverage, then verifies complete authoritative bindings and relationships by readback. Missing observations are disclosed. Spare-part category eligibility does not assert installation or verified model fit; weather operating buffers are not hydrological catchments. Invalid/orphaned keys and missing/stale required forecasts fail preparation. No STID GraphQL API is created.</w:t>
       </w:r>
     </w:p>
     <w:p>
       <w:r>
-        <w:t>SQL-source publication is mandatory and independent of NB09 runtime status; there are no agent mode or skip branches. NB11 preserves compatible SQL/custom content and verifies submitted SQL sources in draft and published readback. Failures propagate after independent outcomes are persisted. Before a source-only bootstrap, the deployer verifies the live notebook code, idle state and Runtime 2.0, bounds the job wait to 15 minutes, and refreshes the verified GraphQL identity. Ordinary deployments with an existing verified GraphQL ID avoid this extra run. NB10 remains configured/stopped; publication and hosting do not certify execution, joins or delivery.</w:t>
+        <w:t>After NB09, mandatory setup_phase=“agent” verifies the same complete live model and publishes its SQL execution adapter without seeding, migration or ontology changes. Ontology SQL bindings do not themselves prove executable SQL capability, so the verified adapter is retained rather than removing it based on metadata. SQL/custom content survives strict draft/published readback. Standalone app/deployer calls retain setup_phase=“all”; seed_demo_data=False preserves records and previous seed status. These calls validate integrity without requiring fresh provider forecasts and explicitly do not attest weather readiness. Legacy migration verifies actual source keys and ontology bindings before setting its write boundary. No graph materialization, agent execution or Teams/email delivery is certified by preparation, publication or app hosting; native instances still require Manage graph and an explicit verified graph binding.</w:t>
       </w:r>
     </w:p>
     <w:p>

</xml_diff>